<commit_message>
feat(seo): upgrade technical SEO, dynamic site URL, and structured data
</commit_message>
<xml_diff>
--- a/public/cv/Reyon-Lau-Jiemin-CV-EN.docx
+++ b/public/cv/Reyon-Lau-Jiemin-CV-EN.docx
@@ -4,31 +4,29 @@
   <w:body>
     <w:p>
       <w:pPr>
-        <w:keepNext w:val="0"/>
-        <w:spacing w:before="0" w:after="0" w:line="252" w:lineRule="auto"/>
+        <w:spacing w:after="40"/>
         <w:jc w:val="center"/>
       </w:pPr>
       <w:r>
         <w:rPr>
           <w:rFonts w:ascii="Calibri" w:hAnsi="Calibri"/>
           <w:b/>
-          <w:i w:val="0"/>
-          <w:sz w:val="34"/>
+          <w:color w:val="000000"/>
+          <w:sz w:val="36"/>
         </w:rPr>
         <w:t>REYON LAU JIEMIN</w:t>
       </w:r>
     </w:p>
     <w:p>
       <w:pPr>
-        <w:keepNext w:val="0"/>
-        <w:spacing w:before="0" w:after="40" w:line="252" w:lineRule="auto"/>
+        <w:spacing w:after="160"/>
         <w:jc w:val="center"/>
       </w:pPr>
       <w:r>
         <w:rPr>
           <w:rFonts w:ascii="Calibri" w:hAnsi="Calibri"/>
-          <w:b w:val="0"/>
-          <w:i w:val="0"/>
+          <w:b/>
+          <w:color w:val="666666"/>
           <w:sz w:val="22"/>
         </w:rPr>
         <w:t>Backend Developer — Laravel / PHP</w:t>
@@ -36,49 +34,42 @@
     </w:p>
     <w:p>
       <w:pPr>
-        <w:keepNext w:val="0"/>
-        <w:spacing w:before="0" w:after="20" w:line="252" w:lineRule="auto"/>
+        <w:spacing w:after="40"/>
         <w:jc w:val="center"/>
       </w:pPr>
       <w:r>
         <w:rPr>
           <w:rFonts w:ascii="Calibri" w:hAnsi="Calibri"/>
           <w:b w:val="0"/>
-          <w:i w:val="0"/>
+          <w:color w:val="333333"/>
           <w:sz w:val="18"/>
         </w:rPr>
-        <w:t>Pagedangan, Kabupaten Tangerang, Banten  |  085211530920  |  liurey55@gmail.com</w:t>
+        <w:t>Pagedangan, Tangerang, Banten  |  +62 852-1153-0920  |  liurey55@gmail.com  |  github.com/Reyonl</w:t>
       </w:r>
     </w:p>
     <w:p>
       <w:pPr>
-        <w:spacing w:before="0" w:after="40" w:line="252" w:lineRule="auto"/>
-        <w:jc w:val="center"/>
+        <w:spacing w:before="40" w:after="120"/>
       </w:pPr>
       <w:r>
         <w:rPr>
           <w:rFonts w:ascii="Calibri" w:hAnsi="Calibri"/>
           <w:b w:val="0"/>
-          <w:i w:val="0"/>
-          <w:color w:val="444C56"/>
-          <w:sz w:val="18"/>
+          <w:color w:val="CCCCCC"/>
+          <w:sz w:val="16"/>
         </w:rPr>
-        <w:t>github.com/Reyonl</w:t>
+        <w:t>────────────────────────────────────────────────────────────────────────────────</w:t>
       </w:r>
     </w:p>
     <w:p>
       <w:pPr>
-        <w:keepNext w:val="0"/>
-        <w:spacing w:before="20" w:after="60" w:line="252" w:lineRule="auto"/>
-        <w:pBdr>
-          <w:bottom w:val="single" w:sz="6" w:space="1" w:color="444444"/>
-        </w:pBdr>
+        <w:spacing w:after="60" w:before="120"/>
       </w:pPr>
       <w:r>
         <w:rPr>
           <w:rFonts w:ascii="Calibri" w:hAnsi="Calibri"/>
           <w:b/>
-          <w:i w:val="0"/>
+          <w:color w:val="4682B4"/>
           <w:sz w:val="20"/>
         </w:rPr>
         <w:t>PROFILE</w:t>
@@ -86,32 +77,84 @@
     </w:p>
     <w:p>
       <w:pPr>
-        <w:keepNext w:val="0"/>
-        <w:spacing w:before="0" w:after="40" w:line="252" w:lineRule="auto"/>
+        <w:spacing w:after="80" w:before="0"/>
+        <w:jc w:val="left"/>
       </w:pPr>
       <w:r>
         <w:rPr>
           <w:rFonts w:ascii="Calibri" w:hAnsi="Calibri"/>
           <w:b w:val="0"/>
-          <w:i w:val="0"/>
-          <w:sz w:val="19"/>
+          <w:sz w:val="20"/>
         </w:rPr>
         <w:t>Informatics Engineering graduate (GPA 3.56) focused on backend development in Laravel/PHP. Experienced building production systems end-to-end: designing a REST API consumed by two clients at once (web and Android), modeling relational databases, writing automated tests, and deploying &amp; debugging directly on production servers. Comfortable with AI-assisted coding workflows while still reading and testing every change.</w:t>
       </w:r>
     </w:p>
     <w:p>
       <w:pPr>
-        <w:keepNext w:val="0"/>
-        <w:spacing w:before="20" w:after="60" w:line="252" w:lineRule="auto"/>
-        <w:pBdr>
-          <w:bottom w:val="single" w:sz="6" w:space="1" w:color="444444"/>
-        </w:pBdr>
+        <w:spacing w:after="60" w:before="120"/>
       </w:pPr>
       <w:r>
         <w:rPr>
           <w:rFonts w:ascii="Calibri" w:hAnsi="Calibri"/>
           <w:b/>
-          <w:i w:val="0"/>
+          <w:color w:val="4682B4"/>
+          <w:sz w:val="20"/>
+        </w:rPr>
+        <w:t>CERTIFICATIONS</w:t>
+      </w:r>
+    </w:p>
+    <w:p>
+      <w:pPr>
+        <w:spacing w:after="80" w:before="0"/>
+        <w:jc w:val="left"/>
+      </w:pPr>
+      <w:r>
+        <w:rPr>
+          <w:rFonts w:ascii="Calibri" w:hAnsi="Calibri"/>
+          <w:b/>
+          <w:sz w:val="20"/>
+        </w:rPr>
+        <w:t>BNSP Certified Web Programmer — Badan Nasional Sertifikasi Profesi (BNSP)</w:t>
+      </w:r>
+    </w:p>
+    <w:p>
+      <w:pPr>
+        <w:spacing w:after="80" w:before="0"/>
+        <w:jc w:val="left"/>
+      </w:pPr>
+      <w:r>
+        <w:rPr>
+          <w:rFonts w:ascii="Calibri" w:hAnsi="Calibri"/>
+          <w:b w:val="0"/>
+          <w:color w:val="666666"/>
+          <w:sz w:val="18"/>
+        </w:rPr>
+        <w:t>April 10, 2026 · valid for 3 years</w:t>
+      </w:r>
+    </w:p>
+    <w:p>
+      <w:pPr>
+        <w:spacing w:before="40" w:after="120"/>
+      </w:pPr>
+      <w:r>
+        <w:rPr>
+          <w:rFonts w:ascii="Calibri" w:hAnsi="Calibri"/>
+          <w:b w:val="0"/>
+          <w:color w:val="CCCCCC"/>
+          <w:sz w:val="16"/>
+        </w:rPr>
+        <w:t>────────────────────────────────────────────────────────────────────────────────</w:t>
+      </w:r>
+    </w:p>
+    <w:p>
+      <w:pPr>
+        <w:spacing w:after="60" w:before="120"/>
+      </w:pPr>
+      <w:r>
+        <w:rPr>
+          <w:rFonts w:ascii="Calibri" w:hAnsi="Calibri"/>
+          <w:b/>
+          <w:color w:val="4682B4"/>
           <w:sz w:val="20"/>
         </w:rPr>
         <w:t>TECHNICAL SKILLS</w:t>
@@ -119,109 +162,83 @@
     </w:p>
     <w:p>
       <w:pPr>
-        <w:spacing w:before="0" w:after="20" w:line="252" w:lineRule="auto"/>
+        <w:spacing w:after="40" w:before="0"/>
+        <w:jc w:val="left"/>
+      </w:pPr>
+      <w:r>
+        <w:rPr>
+          <w:rFonts w:ascii="Calibri" w:hAnsi="Calibri"/>
+          <w:b w:val="0"/>
+          <w:sz w:val="20"/>
+        </w:rPr>
+        <w:t>Backend: PHP 8.3, Laravel, Livewire, REST API, MySQL, Composer, Midtrans Payment Gateway (Snap API), request authentication &amp; validation</w:t>
+      </w:r>
+    </w:p>
+    <w:p>
+      <w:pPr>
+        <w:spacing w:after="40" w:before="0"/>
+        <w:jc w:val="left"/>
+      </w:pPr>
+      <w:r>
+        <w:rPr>
+          <w:rFonts w:ascii="Calibri" w:hAnsi="Calibri"/>
+          <w:b w:val="0"/>
+          <w:sz w:val="20"/>
+        </w:rPr>
+        <w:t>Frontend: React, JavaScript, TypeScript, Tailwind CSS, Next.js, Blade</w:t>
+      </w:r>
+    </w:p>
+    <w:p>
+      <w:pPr>
+        <w:spacing w:after="40" w:before="0"/>
+        <w:jc w:val="left"/>
+      </w:pPr>
+      <w:r>
+        <w:rPr>
+          <w:rFonts w:ascii="Calibri" w:hAnsi="Calibri"/>
+          <w:b w:val="0"/>
+          <w:sz w:val="20"/>
+        </w:rPr>
+        <w:t>Mobile &amp; Tools: Flutter, Dio, Bluetooth thermal printer, Git, GitHub Actions (CI/CD), Docker (basic), Postman, Linux/Windows CLI</w:t>
+      </w:r>
+    </w:p>
+    <w:p>
+      <w:pPr>
+        <w:spacing w:after="80" w:before="0"/>
+        <w:jc w:val="left"/>
+      </w:pPr>
+      <w:r>
+        <w:rPr>
+          <w:rFonts w:ascii="Calibri" w:hAnsi="Calibri"/>
+          <w:b w:val="0"/>
+          <w:sz w:val="20"/>
+        </w:rPr>
+        <w:t>Concepts: MVC, relational database design, automated testing (PHPUnit/Pest, flutter_test, Vitest), production debugging, Git workflow</w:t>
+      </w:r>
+    </w:p>
+    <w:p>
+      <w:pPr>
+        <w:spacing w:before="40" w:after="120"/>
+      </w:pPr>
+      <w:r>
+        <w:rPr>
+          <w:rFonts w:ascii="Calibri" w:hAnsi="Calibri"/>
+          <w:b w:val="0"/>
+          <w:color w:val="CCCCCC"/>
+          <w:sz w:val="16"/>
+        </w:rPr>
+        <w:t>────────────────────────────────────────────────────────────────────────────────</w:t>
+      </w:r>
+    </w:p>
+    <w:p>
+      <w:pPr>
+        <w:spacing w:after="60" w:before="120"/>
       </w:pPr>
       <w:r>
         <w:rPr>
           <w:rFonts w:ascii="Calibri" w:hAnsi="Calibri"/>
           <w:b/>
-          <w:i w:val="0"/>
-          <w:sz w:val="19"/>
-        </w:rPr>
-        <w:t>Backend</w:t>
-      </w:r>
-      <w:r>
-        <w:rPr>
-          <w:rFonts w:ascii="Calibri" w:hAnsi="Calibri"/>
-          <w:b w:val="0"/>
-          <w:i w:val="0"/>
-          <w:sz w:val="19"/>
-        </w:rPr>
-        <w:t>: PHP 8.3, Laravel, Livewire, REST API, MySQL, Composer, Midtrans Payment Gateway (Snap API), request authentication &amp; validation</w:t>
-      </w:r>
-    </w:p>
-    <w:p>
-      <w:pPr>
-        <w:spacing w:before="0" w:after="20" w:line="252" w:lineRule="auto"/>
-      </w:pPr>
-      <w:r>
-        <w:rPr>
-          <w:rFonts w:ascii="Calibri" w:hAnsi="Calibri"/>
-          <w:b/>
-          <w:i w:val="0"/>
-          <w:sz w:val="19"/>
-        </w:rPr>
-        <w:t>Frontend</w:t>
-      </w:r>
-      <w:r>
-        <w:rPr>
-          <w:rFonts w:ascii="Calibri" w:hAnsi="Calibri"/>
-          <w:b w:val="0"/>
-          <w:i w:val="0"/>
-          <w:sz w:val="19"/>
-        </w:rPr>
-        <w:t>: React, JavaScript, TypeScript, Tailwind CSS, Next.js, Blade</w:t>
-      </w:r>
-    </w:p>
-    <w:p>
-      <w:pPr>
-        <w:spacing w:before="0" w:after="20" w:line="252" w:lineRule="auto"/>
-      </w:pPr>
-      <w:r>
-        <w:rPr>
-          <w:rFonts w:ascii="Calibri" w:hAnsi="Calibri"/>
-          <w:b/>
-          <w:i w:val="0"/>
-          <w:sz w:val="19"/>
-        </w:rPr>
-        <w:t>Mobile &amp; Tools</w:t>
-      </w:r>
-      <w:r>
-        <w:rPr>
-          <w:rFonts w:ascii="Calibri" w:hAnsi="Calibri"/>
-          <w:b w:val="0"/>
-          <w:i w:val="0"/>
-          <w:sz w:val="19"/>
-        </w:rPr>
-        <w:t>: Flutter, Dio, Bluetooth thermal printer, Git, GitHub Actions (CI/CD), Docker (basic), Postman, Linux/Windows CLI</w:t>
-      </w:r>
-    </w:p>
-    <w:p>
-      <w:pPr>
-        <w:spacing w:before="0" w:after="40" w:line="252" w:lineRule="auto"/>
-      </w:pPr>
-      <w:r>
-        <w:rPr>
-          <w:rFonts w:ascii="Calibri" w:hAnsi="Calibri"/>
-          <w:b/>
-          <w:i w:val="0"/>
-          <w:sz w:val="19"/>
-        </w:rPr>
-        <w:t>Concepts</w:t>
-      </w:r>
-      <w:r>
-        <w:rPr>
-          <w:rFonts w:ascii="Calibri" w:hAnsi="Calibri"/>
-          <w:b w:val="0"/>
-          <w:i w:val="0"/>
-          <w:sz w:val="19"/>
-        </w:rPr>
-        <w:t>: MVC, relational database design, automated testing (PHPUnit/Pest, flutter_test, Vitest), production debugging, Git workflow</w:t>
-      </w:r>
-    </w:p>
-    <w:p>
-      <w:pPr>
-        <w:keepNext w:val="0"/>
-        <w:spacing w:before="20" w:after="60" w:line="252" w:lineRule="auto"/>
-        <w:pBdr>
-          <w:bottom w:val="single" w:sz="6" w:space="1" w:color="444444"/>
-        </w:pBdr>
-      </w:pPr>
-      <w:r>
-        <w:rPr>
-          <w:rFonts w:ascii="Calibri" w:hAnsi="Calibri"/>
-          <w:b/>
-          <w:i w:val="0"/>
+          <w:color w:val="4682B4"/>
           <w:sz w:val="20"/>
         </w:rPr>
         <w:t>INTERNSHIP EXPERIENCE</w:t>
@@ -229,38 +246,28 @@
     </w:p>
     <w:p>
       <w:pPr>
-        <w:spacing w:before="60" w:after="0" w:line="252" w:lineRule="auto"/>
+        <w:spacing w:after="80" w:before="0"/>
+        <w:jc w:val="left"/>
       </w:pPr>
       <w:r>
         <w:rPr>
           <w:rFonts w:ascii="Calibri" w:hAnsi="Calibri"/>
           <w:b/>
-          <w:i w:val="0"/>
-          <w:sz w:val="19"/>
+          <w:sz w:val="20"/>
         </w:rPr>
-        <w:t>Pusdiklat BPS (Statistics Indonesia) — Public Relations Intern</w:t>
-      </w:r>
-      <w:r>
-        <w:rPr>
-          <w:rFonts w:ascii="Calibri" w:hAnsi="Calibri"/>
-          <w:b w:val="0"/>
-          <w:i w:val="0"/>
-          <w:color w:val="444C56"/>
-          <w:sz w:val="19"/>
-        </w:rPr>
-        <w:t xml:space="preserve">  |  January – March 2026</w:t>
+        <w:t>Pusdiklat BPS (Statistics Indonesia) — Public Relations Intern  |  January – March 2026</w:t>
       </w:r>
     </w:p>
     <w:p>
       <w:pPr>
-        <w:spacing w:before="0" w:after="20" w:line="252" w:lineRule="auto"/>
+        <w:spacing w:after="20" w:before="0"/>
+        <w:jc w:val="left"/>
       </w:pPr>
       <w:r>
         <w:rPr>
           <w:rFonts w:ascii="Calibri" w:hAnsi="Calibri"/>
           <w:b w:val="0"/>
-          <w:i/>
-          <w:color w:val="444C56"/>
+          <w:color w:val="666666"/>
           <w:sz w:val="18"/>
         </w:rPr>
         <w:t>Education and Training Center, BPS · Database Administrator · Creative Team</w:t>
@@ -268,95 +275,55 @@
     </w:p>
     <w:p>
       <w:pPr>
-        <w:pStyle w:val="ListBullet"/>
-        <w:spacing w:before="0" w:after="0" w:line="252" w:lineRule="auto"/>
-        <w:ind w:left="312"/>
+        <w:spacing w:after="60" w:before="40"/>
+        <w:jc w:val="left"/>
       </w:pPr>
       <w:r>
         <w:rPr>
           <w:rFonts w:ascii="Calibri" w:hAnsi="Calibri"/>
           <w:b w:val="0"/>
-          <w:sz w:val="19"/>
+          <w:sz w:val="20"/>
         </w:rPr>
-        <w:t xml:space="preserve">Served as </w:t>
-      </w:r>
-      <w:r>
-        <w:rPr>
-          <w:rFonts w:ascii="Calibri" w:hAnsi="Calibri"/>
-          <w:b/>
-          <w:sz w:val="19"/>
-        </w:rPr>
-        <w:t>database administrator</w:t>
-      </w:r>
-      <w:r>
-        <w:rPr>
-          <w:rFonts w:ascii="Calibri" w:hAnsi="Calibri"/>
-          <w:b w:val="0"/>
-          <w:sz w:val="19"/>
-        </w:rPr>
-        <w:t xml:space="preserve"> for the Public Relations division: managed and maintained the internal database, performed data entry and validation, and ensured data remained complete and accurate.</w:t>
+        <w:t>Served as database administrator for the Public Relations division: managed and maintained the internal database, performed data entry and validation, and ensured data remained complete and accurate.</w:t>
       </w:r>
     </w:p>
     <w:p>
       <w:pPr>
-        <w:pStyle w:val="ListBullet"/>
-        <w:spacing w:before="0" w:after="0" w:line="252" w:lineRule="auto"/>
-        <w:ind w:left="312"/>
+        <w:spacing w:after="80" w:before="0"/>
+        <w:jc w:val="left"/>
       </w:pPr>
       <w:r>
         <w:rPr>
           <w:rFonts w:ascii="Calibri" w:hAnsi="Calibri"/>
           <w:b w:val="0"/>
-          <w:sz w:val="19"/>
+          <w:sz w:val="20"/>
         </w:rPr>
-        <w:t xml:space="preserve">Joined the </w:t>
+        <w:t>Joined the creative team producing the memoir of the Head of Pusdiklat BPS ahead of retirement: curated materials, drafted content, and supported documentation.</w:t>
       </w:r>
-      <w:r>
-        <w:rPr>
-          <w:rFonts w:ascii="Calibri" w:hAnsi="Calibri"/>
-          <w:b/>
-          <w:sz w:val="19"/>
-        </w:rPr>
-        <w:t>creative team</w:t>
-      </w:r>
+    </w:p>
+    <w:p>
+      <w:pPr>
+        <w:spacing w:before="40" w:after="120"/>
+      </w:pPr>
       <w:r>
         <w:rPr>
           <w:rFonts w:ascii="Calibri" w:hAnsi="Calibri"/>
           <w:b w:val="0"/>
-          <w:sz w:val="19"/>
+          <w:color w:val="CCCCCC"/>
+          <w:sz w:val="16"/>
         </w:rPr>
-        <w:t xml:space="preserve"> producing the </w:t>
-      </w:r>
-      <w:r>
-        <w:rPr>
-          <w:rFonts w:ascii="Calibri" w:hAnsi="Calibri"/>
-          <w:b/>
-          <w:sz w:val="19"/>
-        </w:rPr>
-        <w:t>memoir of the Head of Pusdiklat BPS</w:t>
-      </w:r>
-      <w:r>
-        <w:rPr>
-          <w:rFonts w:ascii="Calibri" w:hAnsi="Calibri"/>
-          <w:b w:val="0"/>
-          <w:sz w:val="19"/>
-        </w:rPr>
-        <w:t xml:space="preserve"> ahead of retirement: curated materials, drafted content, and supported documentation.</w:t>
+        <w:t>────────────────────────────────────────────────────────────────────────────────</w:t>
       </w:r>
     </w:p>
     <w:p>
       <w:pPr>
-        <w:keepNext w:val="0"/>
-        <w:spacing w:before="20" w:after="60" w:line="252" w:lineRule="auto"/>
-        <w:pBdr>
-          <w:bottom w:val="single" w:sz="6" w:space="1" w:color="444444"/>
-        </w:pBdr>
+        <w:spacing w:after="60" w:before="120"/>
       </w:pPr>
       <w:r>
         <w:rPr>
           <w:rFonts w:ascii="Calibri" w:hAnsi="Calibri"/>
           <w:b/>
-          <w:i w:val="0"/>
+          <w:color w:val="4682B4"/>
           <w:sz w:val="20"/>
         </w:rPr>
         <w:t>PROJECT EXPERIENCE</w:t>
@@ -364,38 +331,28 @@
     </w:p>
     <w:p>
       <w:pPr>
-        <w:spacing w:before="60" w:after="0" w:line="252" w:lineRule="auto"/>
+        <w:spacing w:after="80" w:before="0"/>
+        <w:jc w:val="left"/>
       </w:pPr>
       <w:r>
         <w:rPr>
           <w:rFonts w:ascii="Calibri" w:hAnsi="Calibri"/>
           <w:b/>
-          <w:i w:val="0"/>
           <w:sz w:val="20"/>
         </w:rPr>
-        <w:t>Warung Lupi — POS &amp; Bookkeeping System (Web + Android)</w:t>
-      </w:r>
-      <w:r>
-        <w:rPr>
-          <w:rFonts w:ascii="Calibri" w:hAnsi="Calibri"/>
-          <w:b w:val="0"/>
-          <w:i w:val="0"/>
-          <w:color w:val="444C56"/>
-          <w:sz w:val="20"/>
-        </w:rPr>
-        <w:t xml:space="preserve">  |  2025 – 2026</w:t>
+        <w:t>Warung Lupi — POS &amp; Bookkeeping System (Web + Android)  |  2025 – 2026</w:t>
       </w:r>
     </w:p>
     <w:p>
       <w:pPr>
-        <w:spacing w:before="0" w:after="20" w:line="252" w:lineRule="auto"/>
+        <w:spacing w:after="20" w:before="0"/>
+        <w:jc w:val="left"/>
       </w:pPr>
       <w:r>
         <w:rPr>
           <w:rFonts w:ascii="Calibri" w:hAnsi="Calibri"/>
           <w:b w:val="0"/>
-          <w:i/>
-          <w:color w:val="444C56"/>
+          <w:color w:val="666666"/>
           <w:sz w:val="18"/>
         </w:rPr>
         <w:t>Laravel, PHP 8.3, MySQL, React, Flutter, REST API</w:t>
@@ -403,147 +360,70 @@
     </w:p>
     <w:p>
       <w:pPr>
-        <w:pStyle w:val="ListBullet"/>
-        <w:spacing w:before="0" w:after="0" w:line="252" w:lineRule="auto"/>
-        <w:ind w:left="312"/>
+        <w:spacing w:after="40" w:before="0"/>
+        <w:jc w:val="left"/>
       </w:pPr>
       <w:r>
         <w:rPr>
           <w:rFonts w:ascii="Calibri" w:hAnsi="Calibri"/>
           <w:b w:val="0"/>
-          <w:sz w:val="19"/>
+          <w:sz w:val="20"/>
         </w:rPr>
-        <w:t xml:space="preserve">Designed and built a </w:t>
-      </w:r>
-      <w:r>
-        <w:rPr>
-          <w:rFonts w:ascii="Calibri" w:hAnsi="Calibri"/>
-          <w:b/>
-          <w:sz w:val="19"/>
-        </w:rPr>
-        <w:t>Laravel REST API</w:t>
-      </w:r>
-      <w:r>
-        <w:rPr>
-          <w:rFonts w:ascii="Calibri" w:hAnsi="Calibri"/>
-          <w:b w:val="0"/>
-          <w:sz w:val="19"/>
-        </w:rPr>
-        <w:t xml:space="preserve"> as the single source of data for two clients: a web app and an Android app.</w:t>
+        <w:t>Designed and built a Laravel REST API as the single source of data for two clients: a web app and an Android app.</w:t>
       </w:r>
     </w:p>
     <w:p>
       <w:pPr>
-        <w:pStyle w:val="ListBullet"/>
-        <w:spacing w:before="0" w:after="0" w:line="252" w:lineRule="auto"/>
-        <w:ind w:left="312"/>
+        <w:spacing w:after="40" w:before="0"/>
+        <w:jc w:val="left"/>
       </w:pPr>
       <w:r>
         <w:rPr>
           <w:rFonts w:ascii="Calibri" w:hAnsi="Calibri"/>
           <w:b w:val="0"/>
-          <w:sz w:val="19"/>
+          <w:sz w:val="20"/>
         </w:rPr>
-        <w:t xml:space="preserve">Built the </w:t>
-      </w:r>
-      <w:r>
-        <w:rPr>
-          <w:rFonts w:ascii="Calibri" w:hAnsi="Calibri"/>
-          <w:b/>
-          <w:sz w:val="19"/>
-        </w:rPr>
-        <w:t>credit/settled/receivables</w:t>
-      </w:r>
-      <w:r>
-        <w:rPr>
-          <w:rFonts w:ascii="Calibri" w:hAnsi="Calibri"/>
-          <w:b w:val="0"/>
-          <w:sz w:val="19"/>
-        </w:rPr>
-        <w:t xml:space="preserve"> modules, automatic promotion rules, and per-item sales reports; shipped with </w:t>
-      </w:r>
-      <w:r>
-        <w:rPr>
-          <w:rFonts w:ascii="Calibri" w:hAnsi="Calibri"/>
-          <w:b/>
-          <w:sz w:val="19"/>
-        </w:rPr>
-        <w:t>automated tests and CI/CD</w:t>
-      </w:r>
-      <w:r>
-        <w:rPr>
-          <w:rFonts w:ascii="Calibri" w:hAnsi="Calibri"/>
-          <w:b w:val="0"/>
-          <w:sz w:val="19"/>
-        </w:rPr>
-        <w:t>, used daily on a production domain.</w:t>
+        <w:t>Built the credit/settled/receivables modules, automatic promotion rules, and per-item sales reports; shipped with automated tests and CI/CD, used daily on a production domain.</w:t>
       </w:r>
     </w:p>
     <w:p>
       <w:pPr>
-        <w:pStyle w:val="ListBullet"/>
-        <w:spacing w:before="0" w:after="0" w:line="252" w:lineRule="auto"/>
-        <w:ind w:left="312"/>
+        <w:spacing w:after="80" w:before="0"/>
+        <w:jc w:val="left"/>
       </w:pPr>
       <w:r>
         <w:rPr>
           <w:rFonts w:ascii="Calibri" w:hAnsi="Calibri"/>
           <w:b w:val="0"/>
-          <w:sz w:val="19"/>
+          <w:sz w:val="20"/>
         </w:rPr>
-        <w:t xml:space="preserve">Diagnosed production server issues (database connectivity &amp; shared-hosting rate limits) and added a client-side </w:t>
-      </w:r>
-      <w:r>
-        <w:rPr>
-          <w:rFonts w:ascii="Calibri" w:hAnsi="Calibri"/>
-          <w:b/>
-          <w:sz w:val="19"/>
-        </w:rPr>
-        <w:t>retry with backoff</w:t>
-      </w:r>
-      <w:r>
-        <w:rPr>
-          <w:rFonts w:ascii="Calibri" w:hAnsi="Calibri"/>
-          <w:b w:val="0"/>
-          <w:sz w:val="19"/>
-        </w:rPr>
-        <w:t xml:space="preserve"> mechanism.</w:t>
+        <w:t>Diagnosed production server issues (database connectivity &amp; shared-hosting rate limits) and added a client-side retry with backoff mechanism.</w:t>
       </w:r>
     </w:p>
     <w:p>
       <w:pPr>
-        <w:spacing w:before="60" w:after="0" w:line="252" w:lineRule="auto"/>
+        <w:spacing w:after="80" w:before="80"/>
+        <w:jc w:val="left"/>
       </w:pPr>
       <w:r>
         <w:rPr>
           <w:rFonts w:ascii="Calibri" w:hAnsi="Calibri"/>
           <w:b/>
-          <w:i w:val="0"/>
           <w:sz w:val="20"/>
         </w:rPr>
-        <w:t>Gadai Enoni Cell — Pawnshop Management System (2-person team)</w:t>
-      </w:r>
-      <w:r>
-        <w:rPr>
-          <w:rFonts w:ascii="Calibri" w:hAnsi="Calibri"/>
-          <w:b w:val="0"/>
-          <w:i w:val="0"/>
-          <w:color w:val="444C56"/>
-          <w:sz w:val="20"/>
-        </w:rPr>
-        <w:t xml:space="preserve">  |  2025</w:t>
+        <w:t>Gadai Enoni Cell — Pawnshop Management System (2-person team)  |  2025</w:t>
       </w:r>
     </w:p>
     <w:p>
       <w:pPr>
-        <w:spacing w:before="0" w:after="20" w:line="252" w:lineRule="auto"/>
+        <w:spacing w:after="20" w:before="0"/>
+        <w:jc w:val="left"/>
       </w:pPr>
       <w:r>
         <w:rPr>
           <w:rFonts w:ascii="Calibri" w:hAnsi="Calibri"/>
           <w:b w:val="0"/>
-          <w:i/>
-          <w:color w:val="444C56"/>
+          <w:color w:val="666666"/>
           <w:sz w:val="18"/>
         </w:rPr>
         <w:t>Laravel, PHP 8.2, MySQL, Midtrans Snap</w:t>
@@ -551,163 +431,70 @@
     </w:p>
     <w:p>
       <w:pPr>
-        <w:pStyle w:val="ListBullet"/>
-        <w:spacing w:before="0" w:after="0" w:line="252" w:lineRule="auto"/>
-        <w:ind w:left="312"/>
+        <w:spacing w:after="40" w:before="0"/>
+        <w:jc w:val="left"/>
       </w:pPr>
       <w:r>
         <w:rPr>
           <w:rFonts w:ascii="Calibri" w:hAnsi="Calibri"/>
           <w:b w:val="0"/>
-          <w:sz w:val="19"/>
+          <w:sz w:val="20"/>
         </w:rPr>
-        <w:t xml:space="preserve">Integrated </w:t>
-      </w:r>
-      <w:r>
-        <w:rPr>
-          <w:rFonts w:ascii="Calibri" w:hAnsi="Calibri"/>
-          <w:b/>
-          <w:sz w:val="19"/>
-        </w:rPr>
-        <w:t>Midtrans Snap payment gateway</w:t>
-      </w:r>
-      <w:r>
-        <w:rPr>
-          <w:rFonts w:ascii="Calibri" w:hAnsi="Calibri"/>
-          <w:b w:val="0"/>
-          <w:sz w:val="19"/>
-        </w:rPr>
-        <w:t xml:space="preserve"> for redemption &amp; extension payments: create/resume/reprocess/cancel, Snap token generation, and a </w:t>
-      </w:r>
-      <w:r>
-        <w:rPr>
-          <w:rFonts w:ascii="Calibri" w:hAnsi="Calibri"/>
-          <w:b/>
-          <w:sz w:val="19"/>
-        </w:rPr>
-        <w:t>webhook notification handler</w:t>
-      </w:r>
-      <w:r>
-        <w:rPr>
-          <w:rFonts w:ascii="Calibri" w:hAnsi="Calibri"/>
-          <w:b w:val="0"/>
-          <w:sz w:val="19"/>
-        </w:rPr>
-        <w:t xml:space="preserve"> that syncs transaction status (sandbox).</w:t>
+        <w:t>Integrated Midtrans Snap payment gateway for redemption &amp; extension payments: create/resume/reprocess/cancel, Snap token generation, and a webhook notification handler that syncs transaction status (sandbox).</w:t>
       </w:r>
     </w:p>
     <w:p>
       <w:pPr>
-        <w:pStyle w:val="ListBullet"/>
-        <w:spacing w:before="0" w:after="0" w:line="252" w:lineRule="auto"/>
-        <w:ind w:left="312"/>
+        <w:spacing w:after="40" w:before="0"/>
+        <w:jc w:val="left"/>
       </w:pPr>
       <w:r>
         <w:rPr>
           <w:rFonts w:ascii="Calibri" w:hAnsi="Calibri"/>
           <w:b w:val="0"/>
-          <w:sz w:val="19"/>
+          <w:sz w:val="20"/>
         </w:rPr>
-        <w:t xml:space="preserve">Built the </w:t>
-      </w:r>
-      <w:r>
-        <w:rPr>
-          <w:rFonts w:ascii="Calibri" w:hAnsi="Calibri"/>
-          <w:b/>
-          <w:sz w:val="19"/>
-        </w:rPr>
-        <w:t>pawnshop business backend</w:t>
-      </w:r>
-      <w:r>
-        <w:rPr>
-          <w:rFonts w:ascii="Calibri" w:hAnsi="Calibri"/>
-          <w:b w:val="0"/>
-          <w:sz w:val="19"/>
-        </w:rPr>
-        <w:t xml:space="preserve">: redemption, extension, auction, price appraisal, tenor interest, branch balances, multi-branch transactions — Eloquent + </w:t>
-      </w:r>
-      <w:r>
-        <w:rPr>
-          <w:rFonts w:ascii="Calibri" w:hAnsi="Calibri"/>
-          <w:b/>
-          <w:sz w:val="19"/>
-        </w:rPr>
-        <w:t>29 migrations</w:t>
-      </w:r>
-      <w:r>
-        <w:rPr>
-          <w:rFonts w:ascii="Calibri" w:hAnsi="Calibri"/>
-          <w:b w:val="0"/>
-          <w:sz w:val="19"/>
-        </w:rPr>
-        <w:t>, multi-role (superadmin/admin/staff/customer).</w:t>
+        <w:t>Built the pawnshop business backend: redemption, extension, auction, price appraisal, tenor interest, branch balances, multi-branch transactions — Eloquent + 29 migrations, multi-role (superadmin/admin/staff/customer).</w:t>
       </w:r>
     </w:p>
     <w:p>
       <w:pPr>
-        <w:pStyle w:val="ListBullet"/>
-        <w:spacing w:before="0" w:after="0" w:line="252" w:lineRule="auto"/>
-        <w:ind w:left="312"/>
+        <w:spacing w:after="80" w:before="0"/>
+        <w:jc w:val="left"/>
       </w:pPr>
       <w:r>
         <w:rPr>
           <w:rFonts w:ascii="Calibri" w:hAnsi="Calibri"/>
           <w:b w:val="0"/>
-          <w:sz w:val="19"/>
+          <w:sz w:val="20"/>
         </w:rPr>
-        <w:t xml:space="preserve">Enforced transaction integrity: prevented double payment &amp; redemption of already-redeemed items; </w:t>
-      </w:r>
-      <w:r>
-        <w:rPr>
-          <w:rFonts w:ascii="Calibri" w:hAnsi="Calibri"/>
-          <w:b/>
-          <w:sz w:val="19"/>
-        </w:rPr>
-        <w:t>pending payment</w:t>
-      </w:r>
-      <w:r>
-        <w:rPr>
-          <w:rFonts w:ascii="Calibri" w:hAnsi="Calibri"/>
-          <w:b w:val="0"/>
-          <w:sz w:val="19"/>
-        </w:rPr>
-        <w:t xml:space="preserve"> state with resume/reprocess; server/client keys via .env, 3DS.</w:t>
+        <w:t>Enforced transaction integrity: prevented double payment &amp; redemption of already-redeemed items; pending payment state with resume/reprocess; server/client keys via .env, 3DS.</w:t>
       </w:r>
     </w:p>
     <w:p>
       <w:pPr>
-        <w:spacing w:before="60" w:after="0" w:line="252" w:lineRule="auto"/>
+        <w:spacing w:after="80" w:before="80"/>
+        <w:jc w:val="left"/>
       </w:pPr>
       <w:r>
         <w:rPr>
           <w:rFonts w:ascii="Calibri" w:hAnsi="Calibri"/>
           <w:b/>
-          <w:i w:val="0"/>
           <w:sz w:val="20"/>
         </w:rPr>
-        <w:t>DAILY.CO — Custom Apparel Ordering System (Undergraduate Thesis)</w:t>
-      </w:r>
-      <w:r>
-        <w:rPr>
-          <w:rFonts w:ascii="Calibri" w:hAnsi="Calibri"/>
-          <w:b w:val="0"/>
-          <w:i w:val="0"/>
-          <w:color w:val="444C56"/>
-          <w:sz w:val="20"/>
-        </w:rPr>
-        <w:t xml:space="preserve">  |  2025 – 2026</w:t>
+        <w:t>DAILY.CO — Custom Apparel Ordering System (Undergraduate Thesis)  |  2025 – 2026</w:t>
       </w:r>
     </w:p>
     <w:p>
       <w:pPr>
-        <w:spacing w:before="0" w:after="20" w:line="252" w:lineRule="auto"/>
+        <w:spacing w:after="20" w:before="0"/>
+        <w:jc w:val="left"/>
       </w:pPr>
       <w:r>
         <w:rPr>
           <w:rFonts w:ascii="Calibri" w:hAnsi="Calibri"/>
           <w:b w:val="0"/>
-          <w:i/>
-          <w:color w:val="444C56"/>
+          <w:color w:val="666666"/>
           <w:sz w:val="18"/>
         </w:rPr>
         <w:t>Laravel, Livewire, Fabric.js, Tailwind CSS, MySQL</w:t>
@@ -715,100 +502,56 @@
     </w:p>
     <w:p>
       <w:pPr>
-        <w:pStyle w:val="ListBullet"/>
-        <w:spacing w:before="0" w:after="0" w:line="252" w:lineRule="auto"/>
-        <w:ind w:left="312"/>
+        <w:spacing w:after="40" w:before="0"/>
+        <w:jc w:val="left"/>
       </w:pPr>
       <w:r>
         <w:rPr>
           <w:rFonts w:ascii="Calibri" w:hAnsi="Calibri"/>
           <w:b w:val="0"/>
-          <w:sz w:val="19"/>
+          <w:sz w:val="20"/>
         </w:rPr>
-        <w:t xml:space="preserve">Built a </w:t>
-      </w:r>
-      <w:r>
-        <w:rPr>
-          <w:rFonts w:ascii="Calibri" w:hAnsi="Calibri"/>
-          <w:b/>
-          <w:sz w:val="19"/>
-        </w:rPr>
-        <w:t>multi-zone canvas design editor</w:t>
-      </w:r>
-      <w:r>
-        <w:rPr>
-          <w:rFonts w:ascii="Calibri" w:hAnsi="Calibri"/>
-          <w:b w:val="0"/>
-          <w:sz w:val="19"/>
-        </w:rPr>
-        <w:t xml:space="preserve"> (Fabric.js) that turns a custom apparel design directly into an order without back-and-forth communication; order flow with admin verification.</w:t>
+        <w:t>Built a multi-zone canvas design editor (Fabric.js) that turns a custom apparel design directly into an order without back-and-forth communication; order flow with admin verification.</w:t>
       </w:r>
     </w:p>
     <w:p>
       <w:pPr>
-        <w:pStyle w:val="ListBullet"/>
-        <w:spacing w:before="0" w:after="0" w:line="252" w:lineRule="auto"/>
-        <w:ind w:left="312"/>
+        <w:spacing w:after="80" w:before="0"/>
+        <w:jc w:val="left"/>
       </w:pPr>
       <w:r>
         <w:rPr>
           <w:rFonts w:ascii="Calibri" w:hAnsi="Calibri"/>
           <w:b w:val="0"/>
-          <w:sz w:val="19"/>
+          <w:sz w:val="20"/>
         </w:rPr>
-        <w:t xml:space="preserve">Wrote </w:t>
-      </w:r>
-      <w:r>
-        <w:rPr>
-          <w:rFonts w:ascii="Calibri" w:hAnsi="Calibri"/>
-          <w:b/>
-          <w:sz w:val="19"/>
-        </w:rPr>
-        <w:t>46 tests (11 files)</w:t>
-      </w:r>
-      <w:r>
-        <w:rPr>
-          <w:rFonts w:ascii="Calibri" w:hAnsi="Calibri"/>
-          <w:b w:val="0"/>
-          <w:sz w:val="19"/>
-        </w:rPr>
-        <w:t xml:space="preserve"> running automatically in CI against MySQL.</w:t>
+        <w:t>Wrote 46 tests (11 files) running automatically in CI against MySQL.</w:t>
       </w:r>
     </w:p>
     <w:p>
       <w:pPr>
-        <w:spacing w:before="60" w:after="0" w:line="252" w:lineRule="auto"/>
+        <w:spacing w:after="80" w:before="80"/>
+        <w:jc w:val="left"/>
       </w:pPr>
       <w:r>
         <w:rPr>
           <w:rFonts w:ascii="Calibri" w:hAnsi="Calibri"/>
           <w:b/>
-          <w:i w:val="0"/>
           <w:sz w:val="20"/>
         </w:rPr>
-        <w:t>Hermes DevOps — Build, Test &amp; Release Automation CLI (private repo)</w:t>
-      </w:r>
-      <w:r>
-        <w:rPr>
-          <w:rFonts w:ascii="Calibri" w:hAnsi="Calibri"/>
-          <w:b w:val="0"/>
-          <w:i w:val="0"/>
-          <w:color w:val="444C56"/>
-          <w:sz w:val="20"/>
-        </w:rPr>
-        <w:t xml:space="preserve">  |  2026 – present</w:t>
+        <w:t>Hermes DevOps — Build, Test &amp; Release Automation CLI (private repo)  |  2026 – present</w:t>
       </w:r>
     </w:p>
     <w:p>
       <w:pPr>
-        <w:spacing w:before="0" w:after="20" w:line="252" w:lineRule="auto"/>
+        <w:spacing w:after="20" w:before="0"/>
+        <w:jc w:val="left"/>
       </w:pPr>
       <w:r>
         <w:rPr>
           <w:rFonts w:ascii="Calibri" w:hAnsi="Calibri"/>
           <w:b w:val="0"/>
-          <w:i/>
-          <w:color w:val="444C56"/>
+          <w:color w:val="666666"/>
           <w:sz w:val="18"/>
         </w:rPr>
         <w:t>TypeScript, Node.js, Git, GitHub Actions</w:t>
@@ -816,100 +559,56 @@
     </w:p>
     <w:p>
       <w:pPr>
-        <w:pStyle w:val="ListBullet"/>
-        <w:spacing w:before="0" w:after="0" w:line="252" w:lineRule="auto"/>
-        <w:ind w:left="312"/>
+        <w:spacing w:after="40" w:before="0"/>
+        <w:jc w:val="left"/>
       </w:pPr>
       <w:r>
         <w:rPr>
           <w:rFonts w:ascii="Calibri" w:hAnsi="Calibri"/>
           <w:b w:val="0"/>
-          <w:sz w:val="19"/>
+          <w:sz w:val="20"/>
         </w:rPr>
-        <w:t xml:space="preserve">Built a CLI that detects a project's stack and runs build/test/release behind </w:t>
-      </w:r>
-      <w:r>
-        <w:rPr>
-          <w:rFonts w:ascii="Calibri" w:hAnsi="Calibri"/>
-          <w:b/>
-          <w:sz w:val="19"/>
-        </w:rPr>
-        <w:t>SAFE/REVIEW/DANGEROUS</w:t>
-      </w:r>
-      <w:r>
-        <w:rPr>
-          <w:rFonts w:ascii="Calibri" w:hAnsi="Calibri"/>
-          <w:b w:val="0"/>
-          <w:sz w:val="19"/>
-        </w:rPr>
-        <w:t xml:space="preserve"> security gates, refusing to report success without evidence.</w:t>
+        <w:t>Built a CLI that detects a project's stack and runs build/test/release behind SAFE/REVIEW/DANGEROUS security gates, refusing to report success without evidence.</w:t>
       </w:r>
     </w:p>
     <w:p>
       <w:pPr>
-        <w:pStyle w:val="ListBullet"/>
-        <w:spacing w:before="0" w:after="0" w:line="252" w:lineRule="auto"/>
-        <w:ind w:left="312"/>
+        <w:spacing w:after="80" w:before="0"/>
+        <w:jc w:val="left"/>
       </w:pPr>
       <w:r>
         <w:rPr>
           <w:rFonts w:ascii="Calibri" w:hAnsi="Calibri"/>
           <w:b w:val="0"/>
-          <w:sz w:val="19"/>
+          <w:sz w:val="20"/>
         </w:rPr>
-        <w:t xml:space="preserve">Wrote </w:t>
-      </w:r>
-      <w:r>
-        <w:rPr>
-          <w:rFonts w:ascii="Calibri" w:hAnsi="Calibri"/>
-          <w:b/>
-          <w:sz w:val="19"/>
-        </w:rPr>
-        <w:t>198 automated tests</w:t>
-      </w:r>
-      <w:r>
-        <w:rPr>
-          <w:rFonts w:ascii="Calibri" w:hAnsi="Calibri"/>
-          <w:b w:val="0"/>
-          <w:sz w:val="19"/>
-        </w:rPr>
-        <w:t xml:space="preserve"> with an append-only audit trail; released up to v0.7.5.</w:t>
+        <w:t>Wrote 198 automated tests with an append-only audit trail; released up to v0.7.5.</w:t>
       </w:r>
     </w:p>
     <w:p>
       <w:pPr>
-        <w:spacing w:before="60" w:after="0" w:line="252" w:lineRule="auto"/>
+        <w:spacing w:after="80" w:before="80"/>
+        <w:jc w:val="left"/>
       </w:pPr>
       <w:r>
         <w:rPr>
           <w:rFonts w:ascii="Calibri" w:hAnsi="Calibri"/>
           <w:b/>
-          <w:i w:val="0"/>
           <w:sz w:val="20"/>
         </w:rPr>
-        <w:t>Personal Portfolio Website</w:t>
-      </w:r>
-      <w:r>
-        <w:rPr>
-          <w:rFonts w:ascii="Calibri" w:hAnsi="Calibri"/>
-          <w:b w:val="0"/>
-          <w:i w:val="0"/>
-          <w:color w:val="444C56"/>
-          <w:sz w:val="20"/>
-        </w:rPr>
-        <w:t xml:space="preserve">  |  2026</w:t>
+        <w:t>Personal Portfolio Website  |  2026</w:t>
       </w:r>
     </w:p>
     <w:p>
       <w:pPr>
-        <w:spacing w:before="0" w:after="20" w:line="252" w:lineRule="auto"/>
+        <w:spacing w:after="20" w:before="0"/>
+        <w:jc w:val="left"/>
       </w:pPr>
       <w:r>
         <w:rPr>
           <w:rFonts w:ascii="Calibri" w:hAnsi="Calibri"/>
           <w:b w:val="0"/>
-          <w:i/>
-          <w:color w:val="444C56"/>
+          <w:color w:val="666666"/>
           <w:sz w:val="18"/>
         </w:rPr>
         <w:t>Next.js, TypeScript, Tailwind CSS, Framer Motion</w:t>
@@ -917,48 +616,41 @@
     </w:p>
     <w:p>
       <w:pPr>
-        <w:pStyle w:val="ListBullet"/>
-        <w:spacing w:before="0" w:after="0" w:line="252" w:lineRule="auto"/>
-        <w:ind w:left="312"/>
+        <w:spacing w:after="80" w:before="0"/>
+        <w:jc w:val="left"/>
       </w:pPr>
       <w:r>
         <w:rPr>
           <w:rFonts w:ascii="Calibri" w:hAnsi="Calibri"/>
           <w:b w:val="0"/>
-          <w:sz w:val="19"/>
+          <w:sz w:val="20"/>
         </w:rPr>
-        <w:t xml:space="preserve">Built from scratch; </w:t>
+        <w:t>Built from scratch; Lighthouse 100/100/100 on desktop; every project claim linked to a verifiable repository &amp; artifact.</w:t>
       </w:r>
-      <w:r>
-        <w:rPr>
-          <w:rFonts w:ascii="Calibri" w:hAnsi="Calibri"/>
-          <w:b/>
-          <w:sz w:val="19"/>
-        </w:rPr>
-        <w:t>Lighthouse 100/100/100</w:t>
-      </w:r>
+    </w:p>
+    <w:p>
+      <w:pPr>
+        <w:spacing w:before="40" w:after="120"/>
+      </w:pPr>
       <w:r>
         <w:rPr>
           <w:rFonts w:ascii="Calibri" w:hAnsi="Calibri"/>
           <w:b w:val="0"/>
-          <w:sz w:val="19"/>
+          <w:color w:val="CCCCCC"/>
+          <w:sz w:val="16"/>
         </w:rPr>
-        <w:t xml:space="preserve"> on desktop; every project claim linked to a verifiable repository &amp; artifact.</w:t>
+        <w:t>────────────────────────────────────────────────────────────────────────────────</w:t>
       </w:r>
     </w:p>
     <w:p>
       <w:pPr>
-        <w:keepNext w:val="0"/>
-        <w:spacing w:before="20" w:after="60" w:line="252" w:lineRule="auto"/>
-        <w:pBdr>
-          <w:bottom w:val="single" w:sz="6" w:space="1" w:color="444444"/>
-        </w:pBdr>
+        <w:spacing w:after="60" w:before="120"/>
       </w:pPr>
       <w:r>
         <w:rPr>
           <w:rFonts w:ascii="Calibri" w:hAnsi="Calibri"/>
           <w:b/>
-          <w:i w:val="0"/>
+          <w:color w:val="4682B4"/>
           <w:sz w:val="20"/>
         </w:rPr>
         <w:t>EDUCATION</w:t>
@@ -966,46 +658,35 @@
     </w:p>
     <w:p>
       <w:pPr>
-        <w:spacing w:before="60" w:after="0" w:line="252" w:lineRule="auto"/>
+        <w:spacing w:after="80" w:before="0"/>
+        <w:jc w:val="left"/>
       </w:pPr>
       <w:r>
         <w:rPr>
           <w:rFonts w:ascii="Calibri" w:hAnsi="Calibri"/>
           <w:b/>
-          <w:i w:val="0"/>
-          <w:sz w:val="19"/>
+          <w:sz w:val="20"/>
         </w:rPr>
-        <w:t>Bachelor of Informatics Engineering — Universitas Pamulang</w:t>
-      </w:r>
-      <w:r>
-        <w:rPr>
-          <w:rFonts w:ascii="Calibri" w:hAnsi="Calibri"/>
-          <w:b w:val="0"/>
-          <w:i w:val="0"/>
-          <w:color w:val="444C56"/>
-          <w:sz w:val="19"/>
-        </w:rPr>
-        <w:t xml:space="preserve">  |  2022 – 2026  |  GPA 3.56 / 4.00</w:t>
+        <w:t>Bachelor of Informatics Engineering — Universitas Pamulang  |  2022 – 2026  |  GPA 3.56 / 4.00</w:t>
       </w:r>
     </w:p>
     <w:p>
       <w:pPr>
-        <w:pStyle w:val="ListBullet"/>
-        <w:spacing w:before="0" w:after="0" w:line="252" w:lineRule="auto"/>
-        <w:ind w:left="312"/>
+        <w:spacing w:after="80" w:before="0"/>
+        <w:jc w:val="left"/>
       </w:pPr>
       <w:r>
         <w:rPr>
           <w:rFonts w:ascii="Calibri" w:hAnsi="Calibri"/>
           <w:b w:val="0"/>
-          <w:sz w:val="19"/>
+          <w:sz w:val="20"/>
         </w:rPr>
         <w:t>Thesis: web-based custom apparel ordering system with a canvas design editor (Laravel, Livewire, Fabric.js).</w:t>
       </w:r>
     </w:p>
     <w:sectPr>
       <w:pgSz w:w="12240" w:h="15840"/>
-      <w:pgMar w:top="510" w:right="794" w:bottom="454" w:left="794" w:header="720" w:footer="720" w:gutter="0"/>
+      <w:pgMar w:top="1080" w:right="1080" w:bottom="1080" w:left="1080" w:header="720" w:footer="720" w:gutter="0"/>
       <w:cols w:space="720"/>
       <w:docGrid w:linePitch="360"/>
     </w:sectPr>
@@ -1376,11 +1057,6 @@
     <w:name w:val="Normal"/>
     <w:qFormat/>
     <w:rsid w:val="00FC693F"/>
-    <w:rPr>
-      <w:rFonts w:ascii="Calibri" w:hAnsi="Calibri" w:cs="Calibri"/>
-      <w:color w:val="1F2A37"/>
-      <w:sz w:val="19"/>
-    </w:rPr>
   </w:style>
   <w:style w:type="paragraph" w:styleId="Header">
     <w:name w:val="header"/>

</xml_diff>